<commit_message>
feat(P7)+docs: cite own prior managerial-moderator paper (Phan et al. 2020) + Nielsen (2010); integration map
Strengthens P7 section 2.5 (Managerial Characteristics / H4 — the weakest-evidenced tier per the audit):
added the authors' own prior firm-level study of manager experience x gender moderating I-P (Phan, Do &
Phan, 2020, Accounting) — also a legitimate self-citation continuity — plus Nielsen (2010, MIR) for the
upper-echelons/foreign-market-entry mechanism. In-text + reference list updated; docx rebuilt.

Added reviews/INTEGRATION_ATTACHED_SOURCES.md mapping the remaining uploaded literature (Schulze et al.
2016 Chindia meta -> P6/P5; Lundan 2007 home-country effects; Cenan & Badulescu 2022 SME I-P; IMF 2025
Asia-Pacific outlook + World Bank China/Indonesia/Mekong updates -> intro/policy framing) to target
sections with ready-to-paste references.
</commit_message>
<xml_diff>
--- a/p7/submission/ibr_package/01_manuscript_blinded.docx
+++ b/p7/submission/ibr_package/01_manuscript_blinded.docx
@@ -2,7 +2,7 @@
 <file path=word/document.xml><?xml version="1.0" encoding="utf-8"?>
 <w:document xmlns:w="http://schemas.openxmlformats.org/wordprocessingml/2006/main" xmlns:m="http://schemas.openxmlformats.org/officeDocument/2006/math" xmlns:r="http://schemas.openxmlformats.org/officeDocument/2006/relationships" xmlns:o="urn:schemas-microsoft-com:office:office" xmlns:v="urn:schemas-microsoft-com:vml" xmlns:w10="urn:schemas-microsoft-com:office:word" xmlns:a="http://schemas.openxmlformats.org/drawingml/2006/main" xmlns:pic="http://schemas.openxmlformats.org/drawingml/2006/picture" xmlns:wp="http://schemas.openxmlformats.org/drawingml/2006/wordprocessingDrawing">
   <w:body>
-    <w:bookmarkStart w:id="78" w:name="Xf24ec467481d62a742d363f12c684976d74bdf7"/>
+    <w:bookmarkStart w:id="80" w:name="Xf24ec467481d62a742d363f12c684976d74bdf7"/>
     <w:p>
       <w:pPr>
         <w:pStyle w:val="Heading1"/>
@@ -1141,7 +1141,31 @@
         <w:t xml:space="preserve"> </w:t>
       </w:r>
       <w:r>
-        <w:t xml:space="preserve">al., 2019). We expect both to raise the performance level for any given</w:t>
+        <w:t xml:space="preserve">al., 2019). Firm-level evidence on manufacturing exporters shows that</w:t>
+      </w:r>
+      <w:r>
+        <w:t xml:space="preserve"> </w:t>
+      </w:r>
+      <w:r>
+        <w:t xml:space="preserve">manager experience and gender can moderate the</w:t>
+      </w:r>
+      <w:r>
+        <w:t xml:space="preserve"> </w:t>
+      </w:r>
+      <w:r>
+        <w:t xml:space="preserve">internationalization–performance relationship (Phan et al., 2020), and</w:t>
+      </w:r>
+      <w:r>
+        <w:t xml:space="preserve"> </w:t>
+      </w:r>
+      <w:r>
+        <w:t xml:space="preserve">top-management-team internationalization shapes performance through</w:t>
+      </w:r>
+      <w:r>
+        <w:t xml:space="preserve"> </w:t>
+      </w:r>
+      <w:r>
+        <w:t xml:space="preserve">foreign-market entry (Nielsen, 2010). We expect both to raise the performance level for any given</w:t>
       </w:r>
       <w:r>
         <w:t xml:space="preserve"> </w:t>
@@ -4132,7 +4156,7 @@
       </w:r>
     </w:p>
     <w:bookmarkEnd w:id="50"/>
-    <w:bookmarkStart w:id="75" w:name="references"/>
+    <w:bookmarkStart w:id="77" w:name="references"/>
     <w:p>
       <w:pPr>
         <w:pStyle w:val="Heading2"/>
@@ -5351,6 +5375,58 @@
         <w:pStyle w:val="BodyText"/>
       </w:pPr>
       <w:r>
+        <w:t xml:space="preserve">Nielsen, S. (2010). Top management team internationalization and firm</w:t>
+      </w:r>
+      <w:r>
+        <w:t xml:space="preserve"> </w:t>
+      </w:r>
+      <w:r>
+        <w:t xml:space="preserve">performance: The mediating role of foreign market entry.</w:t>
+      </w:r>
+      <w:r>
+        <w:t xml:space="preserve"> </w:t>
+      </w:r>
+      <w:r>
+        <w:rPr>
+          <w:iCs/>
+          <w:i/>
+        </w:rPr>
+        <w:t xml:space="preserve">Management</w:t>
+      </w:r>
+      <w:r>
+        <w:rPr>
+          <w:iCs/>
+          <w:i/>
+        </w:rPr>
+        <w:t xml:space="preserve"> </w:t>
+      </w:r>
+      <w:r>
+        <w:rPr>
+          <w:iCs/>
+          <w:i/>
+        </w:rPr>
+        <w:t xml:space="preserve">International Review, 50</w:t>
+      </w:r>
+      <w:r>
+        <w:t xml:space="preserve">(2), 185–206.</w:t>
+      </w:r>
+      <w:r>
+        <w:t xml:space="preserve"> </w:t>
+      </w:r>
+      <w:hyperlink r:id="rId70">
+        <w:r>
+          <w:rPr>
+            <w:rStyle w:val="Hyperlink"/>
+          </w:rPr>
+          <w:t xml:space="preserve">https://doi.org/10.1007/s11575-010-0029-0</w:t>
+        </w:r>
+      </w:hyperlink>
+    </w:p>
+    <w:p>
+      <w:pPr>
+        <w:pStyle w:val="BodyText"/>
+      </w:pPr>
+      <w:r>
         <w:t xml:space="preserve">North, D. C. (1990).</w:t>
       </w:r>
       <w:r>
@@ -5410,7 +5486,7 @@
       <w:r>
         <w:t xml:space="preserve"> </w:t>
       </w:r>
-      <w:hyperlink r:id="rId70">
+      <w:hyperlink r:id="rId71">
         <w:r>
           <w:rPr>
             <w:rStyle w:val="Hyperlink"/>
@@ -5424,6 +5500,56 @@
         <w:pStyle w:val="BodyText"/>
       </w:pPr>
       <w:r>
+        <w:t xml:space="preserve">Phan, A. T., Do, T. H., &amp; Phan, M. T. (2020). The moderating effects of</w:t>
+      </w:r>
+      <w:r>
+        <w:t xml:space="preserve"> </w:t>
+      </w:r>
+      <w:r>
+        <w:t xml:space="preserve">managers' experience and gender on internationalization and firm</w:t>
+      </w:r>
+      <w:r>
+        <w:t xml:space="preserve"> </w:t>
+      </w:r>
+      <w:r>
+        <w:t xml:space="preserve">performance of manufacturing enterprises in Turkey.</w:t>
+      </w:r>
+      <w:r>
+        <w:t xml:space="preserve"> </w:t>
+      </w:r>
+      <w:r>
+        <w:rPr>
+          <w:iCs/>
+          <w:i/>
+        </w:rPr>
+        <w:t xml:space="preserve">Accounting, 6</w:t>
+      </w:r>
+      <w:r>
+        <w:t xml:space="preserve">(7),</w:t>
+      </w:r>
+      <w:r>
+        <w:t xml:space="preserve"> </w:t>
+      </w:r>
+      <w:r>
+        <w:t xml:space="preserve">1209–1216.</w:t>
+      </w:r>
+      <w:r>
+        <w:t xml:space="preserve"> </w:t>
+      </w:r>
+      <w:hyperlink r:id="rId72">
+        <w:r>
+          <w:rPr>
+            <w:rStyle w:val="Hyperlink"/>
+          </w:rPr>
+          <w:t xml:space="preserve">https://doi.org/10.5267/j.ac.2020.9.006</w:t>
+        </w:r>
+      </w:hyperlink>
+    </w:p>
+    <w:p>
+      <w:pPr>
+        <w:pStyle w:val="BodyText"/>
+      </w:pPr>
+      <w:r>
         <w:t xml:space="preserve">Richard, O. C., Kirby, S. L., &amp; Chadwick, K. (2019). The impact of</w:t>
       </w:r>
       <w:r>
@@ -5588,7 +5714,7 @@
       <w:r>
         <w:t xml:space="preserve"> </w:t>
       </w:r>
-      <w:hyperlink r:id="rId71">
+      <w:hyperlink r:id="rId73">
         <w:r>
           <w:rPr>
             <w:rStyle w:val="Hyperlink"/>
@@ -5634,7 +5760,7 @@
       <w:r>
         <w:t xml:space="preserve"> </w:t>
       </w:r>
-      <w:hyperlink r:id="rId72">
+      <w:hyperlink r:id="rId74">
         <w:r>
           <w:rPr>
             <w:rStyle w:val="Hyperlink"/>
@@ -5666,7 +5792,7 @@
       <w:r>
         <w:t xml:space="preserve"> </w:t>
       </w:r>
-      <w:hyperlink r:id="rId73">
+      <w:hyperlink r:id="rId75">
         <w:r>
           <w:rPr>
             <w:rStyle w:val="Hyperlink"/>
@@ -5788,7 +5914,7 @@
       <w:r>
         <w:t xml:space="preserve"> </w:t>
       </w:r>
-      <w:hyperlink r:id="rId74">
+      <w:hyperlink r:id="rId76">
         <w:r>
           <w:rPr>
             <w:rStyle w:val="Hyperlink"/>
@@ -5885,7 +6011,7 @@
       <w:r>
         <w:t xml:space="preserve"> </w:t>
       </w:r>
-      <w:hyperlink r:id="rId74">
+      <w:hyperlink r:id="rId76">
         <w:r>
           <w:rPr>
             <w:rStyle w:val="Hyperlink"/>
@@ -5927,8 +6053,8 @@
         <w:t xml:space="preserve">(4), 305–320.</w:t>
       </w:r>
     </w:p>
-    <w:bookmarkEnd w:id="75"/>
-    <w:bookmarkStart w:id="76" w:name="appendix-a-model-sequence"/>
+    <w:bookmarkEnd w:id="77"/>
+    <w:bookmarkStart w:id="78" w:name="appendix-a-model-sequence"/>
     <w:p>
       <w:pPr>
         <w:pStyle w:val="Heading2"/>
@@ -8812,8 +8938,8 @@
         <w:t xml:space="preserve">mgr_female=+0.187***, female_owner=+0.128**.</w:t>
       </w:r>
     </w:p>
-    <w:bookmarkEnd w:id="76"/>
-    <w:bookmarkStart w:id="77" w:name="X09b5d89c7c8f35bf9d25d1bfe47da72b2ba58bf"/>
+    <w:bookmarkEnd w:id="78"/>
+    <w:bookmarkStart w:id="79" w:name="X09b5d89c7c8f35bf9d25d1bfe47da72b2ba58bf"/>
     <w:p>
       <w:pPr>
         <w:pStyle w:val="Heading2"/>
@@ -8896,8 +9022,8 @@
         <w:t xml:space="preserve">to output-per-worker vs. total-factor productivity operationalisations.</w:t>
       </w:r>
     </w:p>
-    <w:bookmarkEnd w:id="77"/>
-    <w:bookmarkEnd w:id="78"/>
+    <w:bookmarkEnd w:id="79"/>
+    <w:bookmarkEnd w:id="80"/>
     <w:sectPr/>
   </w:body>
 </w:document>

</xml_diff>

<commit_message>
package(p7-ibr): add robustness section to the IBR submission manuscript
Adds Section 4.8 (Robustness) to the IBR capstone manuscript and the working
copy, reporting the four supplementary checks now run on the canonical
50-economy frame: few-cluster wild-cluster bootstrap (CGM, B=9,999),
multiple-testing (Holm/Bonferroni) on the interaction family, cross-schema
measurement invariance, and an inverse-Mills selection check. Updates the
§5.5 selection limitation to reference the new check; adds the Cameron,
Gelbach & Miller (2008) reference; rebuilds the blinded manuscript .docx.

Co-Authored-By: Claude Opus 4.8 (1M context) <noreply@anthropic.com>
Claude-Session: https://claude.ai/code/session_01Xumaoraa2DLWLXsgJJ62oq
</commit_message>
<xml_diff>
--- a/p7/submission/ibr_package/01_manuscript_blinded.docx
+++ b/p7/submission/ibr_package/01_manuscript_blinded.docx
@@ -2,7 +2,7 @@
 <file path=word/document.xml><?xml version="1.0" encoding="utf-8"?>
 <w:document xmlns:w="http://schemas.openxmlformats.org/wordprocessingml/2006/main" xmlns:m="http://schemas.openxmlformats.org/officeDocument/2006/math" xmlns:r="http://schemas.openxmlformats.org/officeDocument/2006/relationships" xmlns:o="urn:schemas-microsoft-com:office:office" xmlns:v="urn:schemas-microsoft-com:vml" xmlns:w10="urn:schemas-microsoft-com:office:word" xmlns:a="http://schemas.openxmlformats.org/drawingml/2006/main" xmlns:pic="http://schemas.openxmlformats.org/drawingml/2006/picture" xmlns:wp="http://schemas.openxmlformats.org/drawingml/2006/wordprocessingDrawing">
   <w:body>
-    <w:bookmarkStart w:id="53" w:name="Xe1057dabf7101c796f791bc61dc6101f2b6f291"/>
+    <w:bookmarkStart w:id="54" w:name="Xe1057dabf7101c796f791bc61dc6101f2b6f291"/>
     <w:p>
       <w:pPr>
         <w:pStyle w:val="Heading1"/>
@@ -722,7 +722,7 @@
     </w:p>
     <w:bookmarkEnd w:id="33"/>
     <w:bookmarkEnd w:id="34"/>
-    <w:bookmarkStart w:id="42" w:name="results"/>
+    <w:bookmarkStart w:id="43" w:name="results"/>
     <w:p>
       <w:pPr>
         <w:pStyle w:val="Heading2"/>
@@ -1113,6 +1113,88 @@
         <w:t xml:space="preserve">of productivity but do not significantly reshape the pooled curve. What reshapes the curve is institutional regime, and it does so not as a smooth gradient but as three discrete zones. In the middle of the institutional gradient (lower-middle transition), the inverted-U is sharp and reliably located near a 43% turning point; at the top (strongest institutions, including Japan), the descending limb is pushed beyond the observable range and the relationship is effectively near-linear; at the bottom (emerging and Pacific SIDS), the inverted-U dissolves and, in the SIDS group, reverses. This three-zone reading reconciles the apparently divergent single-country results in the dissertation (Vietnam and India in the transition zone show sharp inverted-U; Singapore and Japan at the top show near-linearity; the SIDS group shows the Forced Internationalization Penalty) within one harmonised, 50-economy estimation.</w:t>
       </w:r>
     </w:p>
+    <w:bookmarkEnd w:id="41"/>
+    <w:bookmarkStart w:id="42" w:name="robustness"/>
+    <w:p>
+      <w:pPr>
+        <w:pStyle w:val="Heading3"/>
+      </w:pPr>
+      <w:r>
+        <w:t xml:space="preserve">4.8 Robustness</w:t>
+      </w:r>
+    </w:p>
+    <w:p>
+      <w:pPr>
+        <w:pStyle w:val="FirstParagraph"/>
+      </w:pPr>
+      <w:r>
+        <w:t xml:space="preserve">Four supplementary checks bound the inference.</w:t>
+      </w:r>
+      <w:r>
+        <w:t xml:space="preserve"> </w:t>
+      </w:r>
+      <w:r>
+        <w:rPr>
+          <w:iCs/>
+          <w:i/>
+        </w:rPr>
+        <w:t xml:space="preserve">(i) Few-cluster inference.</w:t>
+      </w:r>
+      <w:r>
+        <w:t xml:space="preserve"> </w:t>
+      </w:r>
+      <w:r>
+        <w:t xml:space="preserve">Because the per-ICRV-group turning points rest on only 6–16 economies, cluster-robust (CRV1) standard errors can over-reject. A restricted wild-cluster bootstrap (Cameron, Gelbach, &amp; Miller, 2008; Rademacher weights, B = 9,999, clustered by economy) inflates the per-group curvature p-values: the sharp transition-regime inverted-U (Group IV, β₂ = −1.012) moves from p = 0.001 (CRV1) to p ≈ 0.10, while the emerging and SIDS groups remain non-significant. Formal non-linearity inference is therefore anchored at the pooled level (M2, 49 clusters, β₂ = −1.399, p &lt; .001) and triangulated with the companion meta-analysis, with the per-ICRV turning points read as a descriptive gradient rather than independently powered tests.</w:t>
+      </w:r>
+      <w:r>
+        <w:t xml:space="preserve"> </w:t>
+      </w:r>
+      <w:r>
+        <w:rPr>
+          <w:iCs/>
+          <w:i/>
+        </w:rPr>
+        <w:t xml:space="preserve">(ii) Multiple testing.</w:t>
+      </w:r>
+      <w:r>
+        <w:t xml:space="preserve"> </w:t>
+      </w:r>
+      <w:r>
+        <w:t xml:space="preserve">Holm and Bonferroni corrections applied to the four-term capability-interaction family (FSTS×TCI, FSTS²×TCI, FSTS×DAI, FSTS²×DAI) leave every term non-significant, so the capability-as-level-shifter conclusion is not a false negative produced by uncorrected testing.</w:t>
+      </w:r>
+      <w:r>
+        <w:t xml:space="preserve"> </w:t>
+      </w:r>
+      <w:r>
+        <w:rPr>
+          <w:iCs/>
+          <w:i/>
+        </w:rPr>
+        <w:t xml:space="preserve">(iii) Measurement invariance.</w:t>
+      </w:r>
+      <w:r>
+        <w:t xml:space="preserve"> </w:t>
+      </w:r>
+      <w:r>
+        <w:t xml:space="preserve">The Tier-1 DAI (website) and TCI component items are populated for ~99% of firms in all three WBES schema generations; the DAI mean rises monotonically (0.30 → 0.46 → 0.53), indicating genuine diffusion rather than a schema discontinuity, so cross-wave comparisons rest on item-comparable measures.</w:t>
+      </w:r>
+      <w:r>
+        <w:t xml:space="preserve"> </w:t>
+      </w:r>
+      <w:r>
+        <w:rPr>
+          <w:iCs/>
+          <w:i/>
+        </w:rPr>
+        <w:t xml:space="preserve">(iv) Selection into exporting.</w:t>
+      </w:r>
+      <w:r>
+        <w:t xml:space="preserve"> </w:t>
+      </w:r>
+      <w:r>
+        <w:t xml:space="preserve">Adding an inverse-Mills term from an export-participation probit to the controlled specification leaves the curvature and turning point essentially unchanged (43.6% → 43.5%; β₂ = −0.732, p &lt; .001) with a non-significant Mills ratio (p = 0.317), indicating no detectable Melitz-type selection bias in the estimated curvature. Full procedures and statistics are reported in the online supplement.</w:t>
+      </w:r>
+    </w:p>
     <w:p>
       <w:r>
         <w:pict>
@@ -1120,9 +1202,9 @@
         </w:pict>
       </w:r>
     </w:p>
-    <w:bookmarkEnd w:id="41"/>
     <w:bookmarkEnd w:id="42"/>
-    <w:bookmarkStart w:id="48" w:name="discussion"/>
+    <w:bookmarkEnd w:id="43"/>
+    <w:bookmarkStart w:id="49" w:name="discussion"/>
     <w:p>
       <w:pPr>
         <w:pStyle w:val="Heading2"/>
@@ -1131,7 +1213,7 @@
         <w:t xml:space="preserve">5. Discussion</w:t>
       </w:r>
     </w:p>
-    <w:bookmarkStart w:id="43" w:name="resolution-of-cross-study-heterogeneity"/>
+    <w:bookmarkStart w:id="44" w:name="resolution-of-cross-study-heterogeneity"/>
     <w:p>
       <w:pPr>
         <w:pStyle w:val="Heading3"/>
@@ -1164,8 +1246,8 @@
         <w:t xml:space="preserve">structure: sharp inverted-U in the transition regime (Group IV, TP ≈ 43%), near-linearity in the strongest regime (Group I, TP ≈ 80%, beyond range), and dissolution in the weakest regimes (Group V ≈ 37%; Group VI SIDS, no inverted-U). Whether a single-country study finds an inverted-U at all therefore depends on which institutional zone its economy occupies.</w:t>
       </w:r>
     </w:p>
-    <w:bookmarkEnd w:id="43"/>
-    <w:bookmarkStart w:id="44" w:name="technology-as-amplifier-not-moderator"/>
+    <w:bookmarkEnd w:id="44"/>
+    <w:bookmarkStart w:id="45" w:name="technology-as-amplifier-not-moderator"/>
     <w:p>
       <w:pPr>
         <w:pStyle w:val="Heading3"/>
@@ -1182,8 +1264,8 @@
         <w:t xml:space="preserve">The finding that TCI raises the performance level without reliably reshaping the I–P curve in the pooled sample distinguishes the cross-economy result from country-specific evidence. In P3 Vietnam and P5 China, TCI moderated the curve shape; in the 50-economy pool, institutional heterogeneity attenuates that moderation signal. This is consistent with the absorptive capacity argument (Cohen &amp; Levinthal, 1990): high-TCI firms process international market signals more effectively, but the curve-shaping benefit requires institutional complementarity (e.g., strong IP protection, technology transfer infrastructure) that is inconsistently present across the full ICRV spectrum. The practical implication is that technological capability raises the performance floor universally, but its curve-reshaping role is context-contingent and cannot be assumed at scale.</w:t>
       </w:r>
     </w:p>
-    <w:bookmarkEnd w:id="44"/>
-    <w:bookmarkStart w:id="45" w:name="Xb0069601c8d9c89b5e988d028d21202ed31f250"/>
+    <w:bookmarkEnd w:id="45"/>
+    <w:bookmarkStart w:id="46" w:name="Xb0069601c8d9c89b5e988d028d21202ed31f250"/>
     <w:p>
       <w:pPr>
         <w:pStyle w:val="Heading3"/>
@@ -1234,8 +1316,8 @@
         <w:t xml:space="preserve">across the region, but it should not be sold as a tool for re-shaping the internationalization-performance trade-off.</w:t>
       </w:r>
     </w:p>
-    <w:bookmarkEnd w:id="45"/>
-    <w:bookmarkStart w:id="46" w:name="managerial-heterogeneity"/>
+    <w:bookmarkEnd w:id="46"/>
+    <w:bookmarkStart w:id="47" w:name="managerial-heterogeneity"/>
     <w:p>
       <w:pPr>
         <w:pStyle w:val="Heading3"/>
@@ -1268,8 +1350,8 @@
         <w:t xml:space="preserve">(−0.104, p &lt; .001) rather than positive. This sign is consistent across the dissertation: the single-country Japan study (P10) and the thesis pooled analysis estimate the same negative coefficient. It cautions against a causal reading. In economies where female senior leadership remains rare (the regional pool spans contexts with female-top-manager shares from single digits upward), the small set of female-led establishments is unlikely to be a random draw; the most plausible interpretation is compositional selection into smaller, lower-margin, labour-intensive niches, which a cross-sectional level regression cannot disentangle from any leadership effect. The null curve-moderation result (FSTS×manager terms not significant) indicates that, whatever the source of the level coefficient, manager characteristics do not help firms navigate the internationalization trade-off more efficiently. We therefore report the female-management coefficient as a descriptive regularity requiring within-economy, selection-aware analysis (e.g., matched samples or panel tracking of leadership transitions), not as evidence on the causal effect of female leadership on firm performance.</w:t>
       </w:r>
     </w:p>
-    <w:bookmarkEnd w:id="46"/>
-    <w:bookmarkStart w:id="47" w:name="limitations"/>
+    <w:bookmarkEnd w:id="47"/>
+    <w:bookmarkStart w:id="48" w:name="limitations"/>
     <w:p>
       <w:pPr>
         <w:pStyle w:val="Heading3"/>
@@ -1301,7 +1383,7 @@
         <w:t xml:space="preserve"> </w:t>
       </w:r>
       <w:r>
-        <w:t xml:space="preserve">throughout refers to a contemporaneous association between FSTS and labour productivity in a given survey year, not a panel-tracked causal effect. The IV strategy used in the single-country P3 Vietnam study to address selection into exporting is not available at scale across 50 economies, and capability-based selection into exporting is part of what the capability-adjusted turning point (M4) reveals rather than a nuisance assumed away. Second, the DAI measure is limited to Tier-1 (website) capability in the harmonised pool; the richer digital-capability dimensions captured in more recent BEE-schema waves are not yet available for the majority of economies, which likely contributes to the null curve-reshaping result. Third, the dataset covers all 50 ICRV-mapped economies across six regime groups, including Japan’s inaugural 2025 wave; some early waves predate the digital-capability and manager variables, limiting their contribution to the baseline models. Future WBES waves would sharpen the moderation estimates, particularly for the sparser Advanced and SIDS regimes.</w:t>
+        <w:t xml:space="preserve">throughout refers to a contemporaneous association between FSTS and labour productivity in a given survey year, not a panel-tracked causal effect. The instrumental-variable strategy used in the single-country P3 Vietnam study to address selection into exporting is not available at scale across 50 economies; the pooled inverse-Mills selection check (Section 4.8) indicates the estimated curvature is not driven by selection into exporting, but a panel-tracked causal design remains out of reach, and capability-based selection into exporting is part of what the capability-adjusted turning point (M4) reveals rather than a nuisance assumed away. Second, the DAI measure is limited to Tier-1 (website) capability in the harmonised pool; the richer digital-capability dimensions captured in more recent BEE-schema waves are not yet available for the majority of economies, which likely contributes to the null curve-reshaping result. Third, the dataset covers all 50 ICRV-mapped economies across six regime groups, including Japan’s inaugural 2025 wave; some early waves predate the digital-capability and manager variables, limiting their contribution to the baseline models. Future WBES waves would sharpen the moderation estimates, particularly for the sparser Advanced and SIDS regimes.</w:t>
       </w:r>
     </w:p>
     <w:p>
@@ -1311,9 +1393,9 @@
         </w:pict>
       </w:r>
     </w:p>
-    <w:bookmarkEnd w:id="47"/>
     <w:bookmarkEnd w:id="48"/>
-    <w:bookmarkStart w:id="49" w:name="conclusions"/>
+    <w:bookmarkEnd w:id="49"/>
+    <w:bookmarkStart w:id="50" w:name="conclusions"/>
     <w:p>
       <w:pPr>
         <w:pStyle w:val="Heading2"/>
@@ -1353,8 +1435,8 @@
         </w:pict>
       </w:r>
     </w:p>
-    <w:bookmarkEnd w:id="49"/>
-    <w:bookmarkStart w:id="50" w:name="references"/>
+    <w:bookmarkEnd w:id="50"/>
+    <w:bookmarkStart w:id="51" w:name="references"/>
     <w:p>
       <w:pPr>
         <w:pStyle w:val="Heading2"/>
@@ -1469,6 +1551,27 @@
       </w:r>
       <w:r>
         <w:t xml:space="preserve">(5), 475–492. https://doi.org/10.1007/s11187-005-5599-z</w:t>
+      </w:r>
+    </w:p>
+    <w:p>
+      <w:pPr>
+        <w:pStyle w:val="BodyText"/>
+      </w:pPr>
+      <w:r>
+        <w:t xml:space="preserve">Cameron, A. C., Gelbach, J. B., &amp; Miller, D. L. (2008). Bootstrap-based improvements for inference with clustered errors.</w:t>
+      </w:r>
+      <w:r>
+        <w:t xml:space="preserve"> </w:t>
+      </w:r>
+      <w:r>
+        <w:rPr>
+          <w:iCs/>
+          <w:i/>
+        </w:rPr>
+        <w:t xml:space="preserve">The Review of Economics and Statistics, 90</w:t>
+      </w:r>
+      <w:r>
+        <w:t xml:space="preserve">(3), 414–427. https://doi.org/10.1162/rest.90.3.414</w:t>
       </w:r>
     </w:p>
     <w:p>
@@ -2090,8 +2193,8 @@
         </w:pict>
       </w:r>
     </w:p>
-    <w:bookmarkEnd w:id="50"/>
-    <w:bookmarkStart w:id="51" w:name="appendix-a-model-sequence"/>
+    <w:bookmarkEnd w:id="51"/>
+    <w:bookmarkStart w:id="52" w:name="appendix-a-model-sequence"/>
     <w:p>
       <w:pPr>
         <w:pStyle w:val="Heading2"/>
@@ -5215,8 +5318,8 @@
         </w:pict>
       </w:r>
     </w:p>
-    <w:bookmarkEnd w:id="51"/>
-    <w:bookmarkStart w:id="52" w:name="X09b5d89c7c8f35bf9d25d1bfe47da72b2ba58bf"/>
+    <w:bookmarkEnd w:id="52"/>
+    <w:bookmarkStart w:id="53" w:name="X09b5d89c7c8f35bf9d25d1bfe47da72b2ba58bf"/>
     <w:p>
       <w:pPr>
         <w:pStyle w:val="Heading2"/>
@@ -5252,12 +5355,9 @@
         </w:pict>
       </w:r>
     </w:p>
-    <w:bookmarkEnd w:id="52"/>
     <w:bookmarkEnd w:id="53"/>
-    <w:sectPr>
-      <w:pgSz w:h="16838" w:w="11906"/>
-      <w:pgMar w:bottom="1417" w:left="1417" w:right="1417" w:top="1417"/>
-    </w:sectPr>
+    <w:bookmarkEnd w:id="54"/>
+    <w:sectPr/>
   </w:body>
 </w:document>
 </file>
@@ -5469,59 +5569,29 @@
   <w:style w:default="1" w:styleId="Normal" w:type="paragraph">
     <w:name w:val="Normal"/>
     <w:qFormat/>
-    <w:pPr>
-      <w:spacing w:line="276" w:lineRule="auto"/>
-      <w:jc w:val="both"/>
-    </w:pPr>
-    <w:rPr>
-      <w:rFonts w:ascii="Times New Roman" w:eastAsia="Times New Roman" w:hAnsi="Times New Roman"/>
-      <w:color w:val="000000"/>
-      <w:sz w:val="24"/>
-    </w:rPr>
   </w:style>
   <w:style w:styleId="BodyText" w:type="paragraph">
     <w:name w:val="Body Text"/>
     <w:basedOn w:val="Normal"/>
     <w:link w:val="BodyTextChar"/>
     <w:pPr>
-      <w:spacing w:after="180" w:before="180" w:line="276" w:lineRule="auto"/>
-      <w:jc w:val="both"/>
+      <w:spacing w:after="180" w:before="180"/>
     </w:pPr>
     <w:qFormat/>
-    <w:rPr>
-      <w:rFonts w:ascii="Times New Roman" w:eastAsia="Times New Roman" w:hAnsi="Times New Roman"/>
-      <w:color w:val="000000"/>
-      <w:sz w:val="24"/>
-    </w:rPr>
   </w:style>
   <w:style w:customStyle="1" w:styleId="FirstParagraph" w:type="paragraph">
     <w:name w:val="First Paragraph"/>
     <w:basedOn w:val="BodyText"/>
     <w:next w:val="BodyText"/>
     <w:qFormat/>
-    <w:pPr>
-      <w:spacing w:line="276" w:lineRule="auto"/>
-      <w:jc w:val="both"/>
-    </w:pPr>
-    <w:rPr>
-      <w:rFonts w:ascii="Times New Roman" w:eastAsia="Times New Roman" w:hAnsi="Times New Roman"/>
-      <w:color w:val="000000"/>
-      <w:sz w:val="24"/>
-    </w:rPr>
   </w:style>
   <w:style w:customStyle="1" w:styleId="Compact" w:type="paragraph">
     <w:name w:val="Compact"/>
     <w:basedOn w:val="BodyText"/>
     <w:qFormat/>
     <w:pPr>
-      <w:spacing w:after="36" w:before="36" w:line="276" w:lineRule="auto"/>
-      <w:jc w:val="both"/>
+      <w:spacing w:after="36" w:before="36"/>
     </w:pPr>
-    <w:rPr>
-      <w:rFonts w:ascii="Times New Roman" w:eastAsia="Times New Roman" w:hAnsi="Times New Roman"/>
-      <w:color w:val="000000"/>
-      <w:sz w:val="24"/>
-    </w:rPr>
   </w:style>
   <w:style w:styleId="Title" w:type="paragraph">
     <w:name w:val="Title"/>
@@ -5531,15 +5601,15 @@
     <w:pPr>
       <w:keepNext/>
       <w:keepLines/>
-      <w:spacing w:after="240" w:before="480" w:line="276" w:lineRule="auto"/>
-      <w:jc w:val="both"/>
+      <w:spacing w:after="240" w:before="480"/>
+      <w:jc w:val="center"/>
     </w:pPr>
     <w:rPr>
-      <w:rFonts w:ascii="Times New Roman" w:asciiTheme="majorHAnsi" w:cstheme="majorBidi" w:eastAsia="Times New Roman" w:eastAsiaTheme="majorEastAsia" w:hAnsi="Times New Roman" w:hAnsiTheme="majorHAnsi"/>
+      <w:rFonts w:asciiTheme="majorHAnsi" w:cstheme="majorBidi" w:eastAsiaTheme="majorEastAsia" w:hAnsiTheme="majorHAnsi"/>
       <w:b/>
       <w:bCs/>
-      <w:color w:val="000000"/>
-      <w:sz w:val="24"/>
+      <w:color w:themeColor="accent1" w:themeShade="B5" w:val="345A8A"/>
+      <w:sz w:val="36"/>
       <w:szCs w:val="36"/>
     </w:rPr>
   </w:style>
@@ -5551,13 +5621,11 @@
     <w:pPr>
       <w:keepNext/>
       <w:keepLines/>
-      <w:spacing w:after="240" w:before="240" w:line="276" w:lineRule="auto"/>
-      <w:jc w:val="both"/>
+      <w:spacing w:after="240" w:before="240"/>
+      <w:jc w:val="center"/>
     </w:pPr>
     <w:rPr>
-      <w:rFonts w:ascii="Times New Roman" w:eastAsia="Times New Roman" w:hAnsi="Times New Roman"/>
-      <w:color w:val="000000"/>
-      <w:sz w:val="24"/>
+      <w:sz w:val="30"/>
       <w:szCs w:val="30"/>
     </w:rPr>
   </w:style>
@@ -5568,14 +5636,8 @@
     <w:pPr>
       <w:keepNext/>
       <w:keepLines/>
-      <w:spacing w:line="276" w:lineRule="auto"/>
-      <w:jc w:val="both"/>
+      <w:jc w:val="center"/>
     </w:pPr>
-    <w:rPr>
-      <w:rFonts w:ascii="Times New Roman" w:eastAsia="Times New Roman" w:hAnsi="Times New Roman"/>
-      <w:color w:val="000000"/>
-      <w:sz w:val="24"/>
-    </w:rPr>
   </w:style>
   <w:style w:styleId="Date" w:type="paragraph">
     <w:name w:val="Date"/>
@@ -5584,14 +5646,8 @@
     <w:pPr>
       <w:keepNext/>
       <w:keepLines/>
-      <w:spacing w:line="276" w:lineRule="auto"/>
-      <w:jc w:val="both"/>
+      <w:jc w:val="center"/>
     </w:pPr>
-    <w:rPr>
-      <w:rFonts w:ascii="Times New Roman" w:eastAsia="Times New Roman" w:hAnsi="Times New Roman"/>
-      <w:color w:val="000000"/>
-      <w:sz w:val="24"/>
-    </w:rPr>
   </w:style>
   <w:style w:customStyle="1" w:styleId="AbstractTitle" w:type="paragraph">
     <w:name w:val="Abstract Title"/>
@@ -5601,15 +5657,15 @@
     <w:pPr>
       <w:keepNext/>
       <w:keepLines/>
-      <w:jc w:val="both"/>
-      <w:spacing w:after="0" w:before="300" w:line="276" w:lineRule="auto"/>
+      <w:jc w:val="center"/>
+      <w:spacing w:after="0" w:before="300"/>
     </w:pPr>
     <w:rPr>
-      <w:color w:val="000000"/>
-      <w:sz w:val="24"/>
+      <w:sz w:val="20"/>
       <w:szCs w:val="20"/>
-      <w:rFonts w:ascii="Times New Roman" w:eastAsia="Times New Roman" w:hAnsi="Times New Roman"/>
       <w:b/>
+      <w:color w:val="345A8A"/>
+      &gt;
     </w:rPr>
   </w:style>
   <w:style w:customStyle="1" w:styleId="Abstract" w:type="paragraph">
@@ -5620,13 +5676,10 @@
     <w:pPr>
       <w:keepNext/>
       <w:keepLines/>
-      <w:spacing w:after="300" w:before="100" w:line="276" w:lineRule="auto"/>
-      <w:jc w:val="both"/>
+      <w:spacing w:after="300" w:before="100"/>
     </w:pPr>
     <w:rPr>
-      <w:rFonts w:ascii="Times New Roman" w:eastAsia="Times New Roman" w:hAnsi="Times New Roman"/>
-      <w:color w:val="000000"/>
-      <w:sz w:val="24"/>
+      <w:sz w:val="20"/>
       <w:szCs w:val="20"/>
     </w:rPr>
   </w:style>
@@ -5635,15 +5688,8 @@
     <w:basedOn w:val="Normal"/>
     <w:next w:val="Bibliography"/>
     <w:qFormat/>
-    <w:pPr>
-      <w:spacing w:line="276" w:lineRule="auto"/>
-      <w:jc w:val="both"/>
-    </w:pPr>
-    <w:rPr>
-      <w:rFonts w:ascii="Times New Roman" w:eastAsia="Times New Roman" w:hAnsi="Times New Roman"/>
-      <w:color w:val="000000"/>
-      <w:sz w:val="24"/>
-    </w:rPr>
+    <w:pPr/>
+    <w:rPr/>
   </w:style>
   <w:style w:styleId="Heading1" w:type="paragraph">
     <w:name w:val="Heading 1"/>
@@ -5654,16 +5700,15 @@
     <w:pPr>
       <w:keepNext/>
       <w:keepLines/>
-      <w:spacing w:after="0" w:before="480" w:line="276" w:lineRule="auto"/>
-      <w:jc w:val="both"/>
+      <w:spacing w:after="0" w:before="480"/>
       <w:outlineLvl w:val="0"/>
     </w:pPr>
     <w:rPr>
-      <w:rFonts w:ascii="Times New Roman" w:asciiTheme="majorHAnsi" w:cstheme="majorBidi" w:eastAsia="Times New Roman" w:eastAsiaTheme="majorEastAsia" w:hAnsi="Times New Roman" w:hAnsiTheme="majorHAnsi"/>
+      <w:rFonts w:asciiTheme="majorHAnsi" w:cstheme="majorBidi" w:eastAsiaTheme="majorEastAsia" w:hAnsiTheme="majorHAnsi"/>
       <w:b/>
       <w:bCs/>
-      <w:color w:val="000000"/>
-      <w:sz w:val="24"/>
+      <w:color w:themeColor="accent1" w:val="4F81BD"/>
+      <w:sz w:val="32"/>
       <w:szCs w:val="32"/>
     </w:rPr>
   </w:style>
@@ -5677,16 +5722,15 @@
     <w:pPr>
       <w:keepNext/>
       <w:keepLines/>
-      <w:spacing w:after="0" w:before="200" w:line="276" w:lineRule="auto"/>
-      <w:jc w:val="both"/>
+      <w:spacing w:after="0" w:before="200"/>
       <w:outlineLvl w:val="1"/>
     </w:pPr>
     <w:rPr>
-      <w:rFonts w:ascii="Times New Roman" w:asciiTheme="majorHAnsi" w:cstheme="majorBidi" w:eastAsia="Times New Roman" w:eastAsiaTheme="majorEastAsia" w:hAnsi="Times New Roman" w:hAnsiTheme="majorHAnsi"/>
+      <w:rFonts w:asciiTheme="majorHAnsi" w:cstheme="majorBidi" w:eastAsiaTheme="majorEastAsia" w:hAnsiTheme="majorHAnsi"/>
       <w:b/>
       <w:bCs/>
-      <w:color w:val="000000"/>
-      <w:sz w:val="24"/>
+      <w:color w:themeColor="accent1" w:val="4F81BD"/>
+      <w:sz w:val="28"/>
       <w:szCs w:val="28"/>
     </w:rPr>
   </w:style>
@@ -5700,15 +5744,14 @@
     <w:pPr>
       <w:keepNext/>
       <w:keepLines/>
-      <w:spacing w:after="0" w:before="200" w:line="276" w:lineRule="auto"/>
-      <w:jc w:val="both"/>
+      <w:spacing w:after="0" w:before="200"/>
       <w:outlineLvl w:val="2"/>
     </w:pPr>
     <w:rPr>
-      <w:rFonts w:ascii="Times New Roman" w:asciiTheme="majorHAnsi" w:cstheme="majorBidi" w:eastAsia="Times New Roman" w:eastAsiaTheme="majorEastAsia" w:hAnsi="Times New Roman" w:hAnsiTheme="majorHAnsi"/>
+      <w:rFonts w:asciiTheme="majorHAnsi" w:cstheme="majorBidi" w:eastAsiaTheme="majorEastAsia" w:hAnsiTheme="majorHAnsi"/>
       <w:b/>
       <w:bCs/>
-      <w:color w:val="000000"/>
+      <w:color w:themeColor="accent1" w:val="4F81BD"/>
       <w:sz w:val="24"/>
       <w:szCs w:val="24"/>
     </w:rPr>
@@ -5723,15 +5766,14 @@
     <w:pPr>
       <w:keepNext/>
       <w:keepLines/>
-      <w:spacing w:after="0" w:before="200" w:line="276" w:lineRule="auto"/>
-      <w:jc w:val="both"/>
+      <w:spacing w:after="0" w:before="200"/>
       <w:outlineLvl w:val="3"/>
     </w:pPr>
     <w:rPr>
-      <w:rFonts w:ascii="Times New Roman" w:asciiTheme="majorHAnsi" w:cstheme="majorBidi" w:eastAsia="Times New Roman" w:eastAsiaTheme="majorEastAsia" w:hAnsi="Times New Roman" w:hAnsiTheme="majorHAnsi"/>
+      <w:rFonts w:asciiTheme="majorHAnsi" w:cstheme="majorBidi" w:eastAsiaTheme="majorEastAsia" w:hAnsiTheme="majorHAnsi"/>
       <w:i/>
       <w:bCs/>
-      <w:color w:val="000000"/>
+      <w:color w:themeColor="accent1" w:val="4F81BD"/>
       <w:sz w:val="24"/>
       <w:szCs w:val="24"/>
     </w:rPr>
@@ -5746,14 +5788,13 @@
     <w:pPr>
       <w:keepNext/>
       <w:keepLines/>
-      <w:spacing w:after="0" w:before="200" w:line="276" w:lineRule="auto"/>
-      <w:jc w:val="both"/>
+      <w:spacing w:after="0" w:before="200"/>
       <w:outlineLvl w:val="4"/>
     </w:pPr>
     <w:rPr>
-      <w:rFonts w:ascii="Times New Roman" w:asciiTheme="majorHAnsi" w:cstheme="majorBidi" w:eastAsia="Times New Roman" w:eastAsiaTheme="majorEastAsia" w:hAnsi="Times New Roman" w:hAnsiTheme="majorHAnsi"/>
+      <w:rFonts w:asciiTheme="majorHAnsi" w:cstheme="majorBidi" w:eastAsiaTheme="majorEastAsia" w:hAnsiTheme="majorHAnsi"/>
       <w:iCs/>
-      <w:color w:val="000000"/>
+      <w:color w:themeColor="accent1" w:val="4F81BD"/>
       <w:sz w:val="24"/>
       <w:szCs w:val="24"/>
     </w:rPr>
@@ -5768,13 +5809,12 @@
     <w:pPr>
       <w:keepNext/>
       <w:keepLines/>
-      <w:spacing w:after="0" w:before="200" w:line="276" w:lineRule="auto"/>
-      <w:jc w:val="both"/>
+      <w:spacing w:after="0" w:before="200"/>
       <w:outlineLvl w:val="5"/>
     </w:pPr>
     <w:rPr>
-      <w:rFonts w:ascii="Times New Roman" w:asciiTheme="majorHAnsi" w:cstheme="majorBidi" w:eastAsia="Times New Roman" w:eastAsiaTheme="majorEastAsia" w:hAnsi="Times New Roman" w:hAnsiTheme="majorHAnsi"/>
-      <w:color w:val="000000"/>
+      <w:rFonts w:asciiTheme="majorHAnsi" w:cstheme="majorBidi" w:eastAsiaTheme="majorEastAsia" w:hAnsiTheme="majorHAnsi"/>
+      <w:color w:themeColor="accent1" w:val="4F81BD"/>
       <w:sz w:val="24"/>
       <w:szCs w:val="24"/>
     </w:rPr>
@@ -5789,13 +5829,12 @@
     <w:pPr>
       <w:keepNext/>
       <w:keepLines/>
-      <w:spacing w:after="0" w:before="200" w:line="276" w:lineRule="auto"/>
-      <w:jc w:val="both"/>
+      <w:spacing w:after="0" w:before="200"/>
       <w:outlineLvl w:val="6"/>
     </w:pPr>
     <w:rPr>
-      <w:rFonts w:ascii="Times New Roman" w:asciiTheme="majorHAnsi" w:cstheme="majorBidi" w:eastAsia="Times New Roman" w:eastAsiaTheme="majorEastAsia" w:hAnsi="Times New Roman" w:hAnsiTheme="majorHAnsi"/>
-      <w:color w:val="000000"/>
+      <w:rFonts w:asciiTheme="majorHAnsi" w:cstheme="majorBidi" w:eastAsiaTheme="majorEastAsia" w:hAnsiTheme="majorHAnsi"/>
+      <w:color w:themeColor="accent1" w:val="4F81BD"/>
       <w:sz w:val="24"/>
       <w:szCs w:val="24"/>
     </w:rPr>
@@ -5810,13 +5849,12 @@
     <w:pPr>
       <w:keepNext/>
       <w:keepLines/>
-      <w:spacing w:after="0" w:before="200" w:line="276" w:lineRule="auto"/>
-      <w:jc w:val="both"/>
+      <w:spacing w:after="0" w:before="200"/>
       <w:outlineLvl w:val="7"/>
     </w:pPr>
     <w:rPr>
-      <w:rFonts w:ascii="Times New Roman" w:asciiTheme="majorHAnsi" w:cstheme="majorBidi" w:eastAsia="Times New Roman" w:eastAsiaTheme="majorEastAsia" w:hAnsi="Times New Roman" w:hAnsiTheme="majorHAnsi"/>
-      <w:color w:val="000000"/>
+      <w:rFonts w:asciiTheme="majorHAnsi" w:cstheme="majorBidi" w:eastAsiaTheme="majorEastAsia" w:hAnsiTheme="majorHAnsi"/>
+      <w:color w:themeColor="accent1" w:val="4F81BD"/>
       <w:sz w:val="24"/>
       <w:szCs w:val="24"/>
     </w:rPr>
@@ -5831,13 +5869,12 @@
     <w:pPr>
       <w:keepNext/>
       <w:keepLines/>
-      <w:spacing w:after="0" w:before="200" w:line="276" w:lineRule="auto"/>
-      <w:jc w:val="both"/>
+      <w:spacing w:after="0" w:before="200"/>
       <w:outlineLvl w:val="8"/>
     </w:pPr>
     <w:rPr>
-      <w:rFonts w:ascii="Times New Roman" w:asciiTheme="majorHAnsi" w:cstheme="majorBidi" w:eastAsia="Times New Roman" w:eastAsiaTheme="majorEastAsia" w:hAnsi="Times New Roman" w:hAnsiTheme="majorHAnsi"/>
-      <w:color w:val="000000"/>
+      <w:rFonts w:asciiTheme="majorHAnsi" w:cstheme="majorBidi" w:eastAsiaTheme="majorEastAsia" w:hAnsiTheme="majorHAnsi"/>
+      <w:color w:themeColor="accent1" w:val="4F81BD"/>
       <w:sz w:val="24"/>
       <w:szCs w:val="24"/>
     </w:rPr>
@@ -5850,15 +5887,9 @@
     <w:unhideWhenUsed/>
     <w:qFormat/>
     <w:pPr>
-      <w:spacing w:after="100" w:before="100" w:line="276" w:lineRule="auto"/>
+      <w:spacing w:after="100" w:before="100"/>
       <w:ind w:firstLine="0" w:left="480" w:right="480"/>
-      <w:jc w:val="both"/>
     </w:pPr>
-    <w:rPr>
-      <w:rFonts w:ascii="Times New Roman" w:eastAsia="Times New Roman" w:hAnsi="Times New Roman"/>
-      <w:color w:val="000000"/>
-      <w:sz w:val="24"/>
-    </w:rPr>
   </w:style>
   <w:style w:styleId="FootnoteText" w:type="paragraph">
     <w:name w:val="Footnote Text"/>
@@ -5867,25 +5898,11 @@
     <w:uiPriority w:val="9"/>
     <w:unhideWhenUsed/>
     <w:qFormat/>
-    <w:pPr>
-      <w:spacing w:line="276" w:lineRule="auto"/>
-      <w:jc w:val="both"/>
-    </w:pPr>
-    <w:rPr>
-      <w:rFonts w:ascii="Times New Roman" w:eastAsia="Times New Roman" w:hAnsi="Times New Roman"/>
-      <w:color w:val="000000"/>
-      <w:sz w:val="24"/>
-    </w:rPr>
   </w:style>
   <w:style w:default="1" w:styleId="DefaultParagraphFont" w:type="character">
     <w:name w:val="Default Paragraph Font"/>
     <w:semiHidden/>
     <w:unhideWhenUsed/>
-    <w:rPr>
-      <w:rFonts w:ascii="Times New Roman" w:eastAsia="Times New Roman" w:hAnsi="Times New Roman"/>
-      <w:color w:val="000000"/>
-      <w:sz w:val="24"/>
-    </w:rPr>
   </w:style>
   <w:style w:default="1" w:styleId="Table" w:type="table">
     <w:name w:val="Table"/>
@@ -5893,15 +5910,6 @@
     <w:semiHidden/>
     <w:unhideWhenUsed/>
     <w:qFormat/>
-    <w:pPr>
-      <w:spacing w:line="276" w:lineRule="auto"/>
-      <w:jc w:val="both"/>
-    </w:pPr>
-    <w:rPr>
-      <w:rFonts w:ascii="Times New Roman" w:eastAsia="Times New Roman" w:hAnsi="Times New Roman"/>
-      <w:color w:val="000000"/>
-      <w:sz w:val="24"/>
-    </w:rPr>
     <w:tblPr>
       <w:tblInd w:type="dxa" w:w="0"/>
       <w:tblCellMar>
@@ -5934,42 +5942,25 @@
     <w:pPr>
       <w:keepNext/>
       <w:keepLines/>
-      <w:spacing w:after="0" w:line="276" w:lineRule="auto"/>
-      <w:jc w:val="both"/>
+      <w:spacing w:after="0"/>
     </w:pPr>
     <w:rPr>
-      <w:rFonts w:ascii="Times New Roman" w:eastAsia="Times New Roman" w:hAnsi="Times New Roman"/>
       <w:b/>
-      <w:color w:val="000000"/>
-      <w:sz w:val="24"/>
     </w:rPr>
   </w:style>
   <w:style w:customStyle="1" w:styleId="Definition" w:type="paragraph">
     <w:name w:val="Definition"/>
     <w:basedOn w:val="Normal"/>
-    <w:pPr>
-      <w:spacing w:line="276" w:lineRule="auto"/>
-      <w:jc w:val="both"/>
-    </w:pPr>
-    <w:rPr>
-      <w:rFonts w:ascii="Times New Roman" w:eastAsia="Times New Roman" w:hAnsi="Times New Roman"/>
-      <w:color w:val="000000"/>
-      <w:sz w:val="24"/>
-    </w:rPr>
   </w:style>
   <w:style w:styleId="Caption" w:type="paragraph">
     <w:name w:val="Caption"/>
     <w:basedOn w:val="Normal"/>
     <w:link w:val="BodyTextChar"/>
     <w:pPr>
-      <w:spacing w:after="120" w:before="0" w:line="276" w:lineRule="auto"/>
-      <w:jc w:val="both"/>
+      <w:spacing w:after="120" w:before="0"/>
     </w:pPr>
     <w:rPr>
-      <w:rFonts w:ascii="Times New Roman" w:eastAsia="Times New Roman" w:hAnsi="Times New Roman"/>
       <w:i/>
-      <w:color w:val="000000"/>
-      <w:sz w:val="24"/>
     </w:rPr>
   </w:style>
   <w:style w:customStyle="1" w:styleId="TableCaption" w:type="paragraph">
@@ -5977,90 +5968,44 @@
     <w:basedOn w:val="Caption"/>
     <w:pPr>
       <w:keepNext/>
-      <w:spacing w:line="276" w:lineRule="auto"/>
-      <w:jc w:val="both"/>
     </w:pPr>
-    <w:rPr>
-      <w:rFonts w:ascii="Times New Roman" w:eastAsia="Times New Roman" w:hAnsi="Times New Roman"/>
-      <w:color w:val="000000"/>
-      <w:sz w:val="24"/>
-    </w:rPr>
   </w:style>
   <w:style w:customStyle="1" w:styleId="ImageCaption" w:type="paragraph">
     <w:name w:val="Image Caption"/>
     <w:basedOn w:val="Caption"/>
-    <w:pPr>
-      <w:spacing w:line="276" w:lineRule="auto"/>
-      <w:jc w:val="both"/>
-    </w:pPr>
-    <w:rPr>
-      <w:rFonts w:ascii="Times New Roman" w:eastAsia="Times New Roman" w:hAnsi="Times New Roman"/>
-      <w:color w:val="000000"/>
-      <w:sz w:val="24"/>
-    </w:rPr>
   </w:style>
   <w:style w:customStyle="1" w:styleId="Figure" w:type="paragraph">
     <w:name w:val="Figure"/>
     <w:basedOn w:val="Normal"/>
-    <w:pPr>
-      <w:spacing w:line="276" w:lineRule="auto"/>
-      <w:jc w:val="both"/>
-    </w:pPr>
-    <w:rPr>
-      <w:rFonts w:ascii="Times New Roman" w:eastAsia="Times New Roman" w:hAnsi="Times New Roman"/>
-      <w:color w:val="000000"/>
-      <w:sz w:val="24"/>
-    </w:rPr>
   </w:style>
   <w:style w:customStyle="1" w:styleId="CaptionedFigure" w:type="paragraph">
     <w:name w:val="Captioned Figure"/>
     <w:basedOn w:val="Figure"/>
     <w:pPr>
       <w:keepNext/>
-      <w:spacing w:line="276" w:lineRule="auto"/>
-      <w:jc w:val="both"/>
     </w:pPr>
-    <w:rPr>
-      <w:rFonts w:ascii="Times New Roman" w:eastAsia="Times New Roman" w:hAnsi="Times New Roman"/>
-      <w:color w:val="000000"/>
-      <w:sz w:val="24"/>
-    </w:rPr>
   </w:style>
   <w:style w:customStyle="1" w:styleId="BodyTextChar" w:type="character">
     <w:name w:val="Body Text Char"/>
     <w:basedOn w:val="DefaultParagraphFont"/>
     <w:link w:val="BodyText"/>
-    <w:rPr>
-      <w:rFonts w:ascii="Times New Roman" w:eastAsia="Times New Roman" w:hAnsi="Times New Roman"/>
-      <w:color w:val="000000"/>
-      <w:sz w:val="24"/>
-    </w:rPr>
   </w:style>
   <w:style w:customStyle="1" w:styleId="VerbatimChar" w:type="character">
     <w:name w:val="Verbatim Char"/>
     <w:basedOn w:val="BodyTextChar"/>
     <w:rPr>
-      <w:rFonts w:ascii="Times New Roman" w:eastAsia="Times New Roman" w:hAnsi="Times New Roman"/>
-      <w:color w:val="000000"/>
-      <w:sz w:val="24"/>
+      <w:rFonts w:ascii="Consolas" w:hAnsi="Consolas"/>
+      <w:sz w:val="22"/>
     </w:rPr>
   </w:style>
   <w:style w:customStyle="1" w:styleId="SectionNumber" w:type="character">
     <w:name w:val="Section Number"/>
     <w:basedOn w:val="BodyTextChar"/>
-    <w:rPr>
-      <w:rFonts w:ascii="Times New Roman" w:eastAsia="Times New Roman" w:hAnsi="Times New Roman"/>
-      <w:color w:val="000000"/>
-      <w:sz w:val="24"/>
-    </w:rPr>
   </w:style>
   <w:style w:styleId="FootnoteReference" w:type="character">
     <w:name w:val="Footnote Reference"/>
     <w:basedOn w:val="BodyTextChar"/>
     <w:rPr>
-      <w:rFonts w:ascii="Times New Roman" w:eastAsia="Times New Roman" w:hAnsi="Times New Roman"/>
-      <w:color w:val="000000"/>
-      <w:sz w:val="24"/>
       <w:vertAlign w:val="superscript"/>
     </w:rPr>
   </w:style>
@@ -6068,9 +6013,7 @@
     <w:name w:val="Hyperlink"/>
     <w:basedOn w:val="BodyTextChar"/>
     <w:rPr>
-      <w:rFonts w:ascii="Times New Roman" w:eastAsia="Times New Roman" w:hAnsi="Times New Roman"/>
-      <w:color w:val="000000"/>
-      <w:sz w:val="24"/>
+      <w:color w:themeColor="accent1" w:val="4F81BD"/>
     </w:rPr>
   </w:style>
   <w:style w:styleId="TOCHeading" w:type="paragraph">
@@ -6081,16 +6024,14 @@
     <w:unhideWhenUsed/>
     <w:qFormat/>
     <w:pPr>
-      <w:spacing w:before="240" w:line="276" w:lineRule="auto"/>
-      <w:jc w:val="both"/>
+      <w:spacing w:before="240" w:line="259" w:lineRule="auto"/>
       <w:outlineLvl w:val="9"/>
     </w:pPr>
     <w:rPr>
-      <w:rFonts w:ascii="Times New Roman" w:asciiTheme="majorHAnsi" w:cstheme="majorBidi" w:eastAsia="Times New Roman" w:eastAsiaTheme="majorEastAsia" w:hAnsi="Times New Roman" w:hAnsiTheme="majorHAnsi"/>
+      <w:rFonts w:asciiTheme="majorHAnsi" w:cstheme="majorBidi" w:eastAsiaTheme="majorEastAsia" w:hAnsiTheme="majorHAnsi"/>
       <w:b w:val="0"/>
       <w:bCs w:val="0"/>
-      <w:color w:val="000000"/>
-      <w:sz w:val="24"/>
+      <w:color w:themeColor="accent1" w:themeShade="BF" w:val="365F91"/>
     </w:rPr>
   </w:style>
   <w:style w:type="paragraph" w:customStyle="1" w:styleId="SourceCode">

</xml_diff>